<commit_message>
Clean markdown artifacts from all submission docs
</commit_message>
<xml_diff>
--- a/submissions/AITP_OWASP_Project_Overview.docx
+++ b/submissions/AITP_OWASP_Project_Overview.docx
@@ -40,7 +40,7 @@
                 <w:b/>
                 <w:sz w:val="20"/>
               </w:rPr>
-              <w:t>**Project Name**</w:t>
+              <w:t>Project Name</w:t>
             </w:r>
           </w:p>
         </w:tc>
@@ -71,7 +71,7 @@
               <w:rPr>
                 <w:sz w:val="20"/>
               </w:rPr>
-              <w:t>**Project Leaders**</w:t>
+              <w:t>Project Leaders</w:t>
             </w:r>
           </w:p>
         </w:tc>
@@ -85,7 +85,7 @@
               <w:rPr>
                 <w:sz w:val="20"/>
               </w:rPr>
-              <w:t>[Michael Harrison](mailto:michael@osinfo.io), [Ard Haskell](mailto:ard@osinfo.io)</w:t>
+              <w:t>Michael Harrison, Ard Haskell</w:t>
             </w:r>
           </w:p>
         </w:tc>
@@ -101,7 +101,7 @@
               <w:rPr>
                 <w:sz w:val="20"/>
               </w:rPr>
-              <w:t>**Organization**</w:t>
+              <w:t>Organization</w:t>
             </w:r>
           </w:p>
         </w:tc>
@@ -131,7 +131,7 @@
               <w:rPr>
                 <w:sz w:val="20"/>
               </w:rPr>
-              <w:t>**Classification**</w:t>
+              <w:t>Classification</w:t>
             </w:r>
           </w:p>
         </w:tc>
@@ -161,7 +161,7 @@
               <w:rPr>
                 <w:sz w:val="20"/>
               </w:rPr>
-              <w:t>**Project Level**</w:t>
+              <w:t>Project Level</w:t>
             </w:r>
           </w:p>
         </w:tc>
@@ -191,7 +191,7 @@
               <w:rPr>
                 <w:sz w:val="20"/>
               </w:rPr>
-              <w:t>**License**</w:t>
+              <w:t>License</w:t>
             </w:r>
           </w:p>
         </w:tc>
@@ -205,7 +205,7 @@
               <w:rPr>
                 <w:sz w:val="20"/>
               </w:rPr>
-              <w:t>[CC BY-SA 4.0](https://creativecommons.org/licenses/by-sa/4.0/)</w:t>
+              <w:t>CC BY-SA 4.0</w:t>
             </w:r>
           </w:p>
         </w:tc>
@@ -221,7 +221,7 @@
               <w:rPr>
                 <w:sz w:val="20"/>
               </w:rPr>
-              <w:t>**Version**</w:t>
+              <w:t>Version</w:t>
             </w:r>
           </w:p>
         </w:tc>
@@ -251,7 +251,7 @@
               <w:rPr>
                 <w:sz w:val="20"/>
               </w:rPr>
-              <w:t>**Date**</w:t>
+              <w:t>Date</w:t>
             </w:r>
           </w:p>
         </w:tc>
@@ -370,7 +370,7 @@
               <w:rPr>
                 <w:sz w:val="20"/>
               </w:rPr>
-              <w:t>[AITP Specification](AITP-Specification.md)</w:t>
+              <w:t>AITP Specification</w:t>
             </w:r>
           </w:p>
         </w:tc>
@@ -400,7 +400,7 @@
               <w:rPr>
                 <w:sz w:val="20"/>
               </w:rPr>
-              <w:t>[AITP Top 10 Agent Trust Risks](AITP-Top-10.md)</w:t>
+              <w:t>AITP Top 10 Agent Trust Risks</w:t>
             </w:r>
           </w:p>
         </w:tc>
@@ -430,7 +430,7 @@
               <w:rPr>
                 <w:sz w:val="20"/>
               </w:rPr>
-              <w:t>[AITP / OWASP Agentic Top 10 Crosswalk](AITP-Agentic-Top10-Crosswalk.md)</w:t>
+              <w:t>AITP / OWASP Agentic Top 10 Crosswalk</w:t>
             </w:r>
           </w:p>
         </w:tc>

</xml_diff>